<commit_message>
Sync latest OneDrive project
</commit_message>
<xml_diff>
--- a/docs/COIT12204_A3_Report_Tanjim_Ahmed_Mahi.docx
+++ b/docs/COIT12204_A3_Report_Tanjim_Ahmed_Mahi.docx
@@ -790,7 +790,7 @@
                 <w:sz w:val="20"/>
                 <w:szCs w:val="20"/>
               </w:rPr>
-              <w:t>22 / 22 (100%)</w:t>
+              <w:t>20 / 22 (91%)</w:t>
             </w:r>
           </w:p>
         </w:tc>
@@ -850,7 +850,7 @@
                 <w:sz w:val="20"/>
                 <w:szCs w:val="20"/>
               </w:rPr>
-              <w:t>91%</w:t>
+              <w:t>100%</w:t>
             </w:r>
           </w:p>
         </w:tc>
@@ -870,7 +870,7 @@
                 <w:sz w:val="20"/>
                 <w:szCs w:val="20"/>
               </w:rPr>
-              <w:t>5.1 s</w:t>
+              <w:t>2.2 s</w:t>
             </w:r>
           </w:p>
         </w:tc>
@@ -899,134 +899,6 @@
                 <w:szCs w:val="20"/>
               </w:rPr>
               <w:t>v2</w:t>
-            </w:r>
-          </w:p>
-        </w:tc>
-        <w:tc>
-          <w:tcPr>
-            <w:tcW w:w="2300" w:type="dxa"/>
-            <w:tcMar>
-              <w:top w:w="60" w:type="dxa"/>
-              <w:left w:w="100" w:type="dxa"/>
-              <w:bottom w:w="60" w:type="dxa"/>
-              <w:right w:w="100" w:type="dxa"/>
-            </w:tcMar>
-          </w:tcPr>
-          <w:p>
-            <w:r>
-              <w:rPr>
-                <w:sz w:val="20"/>
-                <w:szCs w:val="20"/>
-              </w:rPr>
-              <w:t>22 / 22 (100%)</w:t>
-            </w:r>
-          </w:p>
-        </w:tc>
-        <w:tc>
-          <w:tcPr>
-            <w:tcW w:w="2300" w:type="dxa"/>
-            <w:tcMar>
-              <w:top w:w="60" w:type="dxa"/>
-              <w:left w:w="100" w:type="dxa"/>
-              <w:bottom w:w="60" w:type="dxa"/>
-              <w:right w:w="100" w:type="dxa"/>
-            </w:tcMar>
-          </w:tcPr>
-          <w:p>
-            <w:r>
-              <w:rPr>
-                <w:sz w:val="20"/>
-                <w:szCs w:val="20"/>
-              </w:rPr>
-              <w:t>1</w:t>
-            </w:r>
-          </w:p>
-        </w:tc>
-        <w:tc>
-          <w:tcPr>
-            <w:tcW w:w="2300" w:type="dxa"/>
-            <w:tcMar>
-              <w:top w:w="60" w:type="dxa"/>
-              <w:left w:w="100" w:type="dxa"/>
-              <w:bottom w:w="60" w:type="dxa"/>
-              <w:right w:w="100" w:type="dxa"/>
-            </w:tcMar>
-          </w:tcPr>
-          <w:p>
-            <w:r>
-              <w:rPr>
-                <w:sz w:val="20"/>
-                <w:szCs w:val="20"/>
-              </w:rPr>
-              <w:t>2</w:t>
-            </w:r>
-          </w:p>
-        </w:tc>
-        <w:tc>
-          <w:tcPr>
-            <w:tcW w:w="2300" w:type="dxa"/>
-            <w:tcMar>
-              <w:top w:w="60" w:type="dxa"/>
-              <w:left w:w="100" w:type="dxa"/>
-              <w:bottom w:w="60" w:type="dxa"/>
-              <w:right w:w="100" w:type="dxa"/>
-            </w:tcMar>
-          </w:tcPr>
-          <w:p>
-            <w:r>
-              <w:rPr>
-                <w:sz w:val="20"/>
-                <w:szCs w:val="20"/>
-              </w:rPr>
-              <w:t>100%</w:t>
-            </w:r>
-          </w:p>
-        </w:tc>
-        <w:tc>
-          <w:tcPr>
-            <w:tcW w:w="2300" w:type="dxa"/>
-            <w:tcMar>
-              <w:top w:w="60" w:type="dxa"/>
-              <w:left w:w="100" w:type="dxa"/>
-              <w:bottom w:w="60" w:type="dxa"/>
-              <w:right w:w="100" w:type="dxa"/>
-            </w:tcMar>
-          </w:tcPr>
-          <w:p>
-            <w:r>
-              <w:rPr>
-                <w:sz w:val="20"/>
-                <w:szCs w:val="20"/>
-              </w:rPr>
-              <w:t>3.7 s</w:t>
-            </w:r>
-          </w:p>
-        </w:tc>
-      </w:tr>
-      <w:tr>
-        <w:tblPrEx>
-          <w:tblCellMar>
-            <w:top w:w="0" w:type="dxa"/>
-            <w:bottom w:w="0" w:type="dxa"/>
-          </w:tblCellMar>
-        </w:tblPrEx>
-        <w:tc>
-          <w:tcPr>
-            <w:tcW w:w="2300" w:type="dxa"/>
-            <w:tcMar>
-              <w:top w:w="60" w:type="dxa"/>
-              <w:left w:w="100" w:type="dxa"/>
-              <w:bottom w:w="60" w:type="dxa"/>
-              <w:right w:w="100" w:type="dxa"/>
-            </w:tcMar>
-          </w:tcPr>
-          <w:p>
-            <w:r>
-              <w:rPr>
-                <w:sz w:val="20"/>
-                <w:szCs w:val="20"/>
-              </w:rPr>
-              <w:t>v3</w:t>
             </w:r>
           </w:p>
         </w:tc>
@@ -1106,7 +978,7 @@
                 <w:sz w:val="20"/>
                 <w:szCs w:val="20"/>
               </w:rPr>
-              <w:t>91%</w:t>
+              <w:t>100%</w:t>
             </w:r>
           </w:p>
         </w:tc>
@@ -1126,7 +998,135 @@
                 <w:sz w:val="20"/>
                 <w:szCs w:val="20"/>
               </w:rPr>
-              <w:t>4.2 s</w:t>
+              <w:t>2.2 s</w:t>
+            </w:r>
+          </w:p>
+        </w:tc>
+      </w:tr>
+      <w:tr>
+        <w:tblPrEx>
+          <w:tblCellMar>
+            <w:top w:w="0" w:type="dxa"/>
+            <w:bottom w:w="0" w:type="dxa"/>
+          </w:tblCellMar>
+        </w:tblPrEx>
+        <w:tc>
+          <w:tcPr>
+            <w:tcW w:w="2300" w:type="dxa"/>
+            <w:tcMar>
+              <w:top w:w="60" w:type="dxa"/>
+              <w:left w:w="100" w:type="dxa"/>
+              <w:bottom w:w="60" w:type="dxa"/>
+              <w:right w:w="100" w:type="dxa"/>
+            </w:tcMar>
+          </w:tcPr>
+          <w:p>
+            <w:r>
+              <w:rPr>
+                <w:sz w:val="20"/>
+                <w:szCs w:val="20"/>
+              </w:rPr>
+              <w:t>v3</w:t>
+            </w:r>
+          </w:p>
+        </w:tc>
+        <w:tc>
+          <w:tcPr>
+            <w:tcW w:w="2300" w:type="dxa"/>
+            <w:tcMar>
+              <w:top w:w="60" w:type="dxa"/>
+              <w:left w:w="100" w:type="dxa"/>
+              <w:bottom w:w="60" w:type="dxa"/>
+              <w:right w:w="100" w:type="dxa"/>
+            </w:tcMar>
+          </w:tcPr>
+          <w:p>
+            <w:r>
+              <w:rPr>
+                <w:sz w:val="20"/>
+                <w:szCs w:val="20"/>
+              </w:rPr>
+              <w:t>22 / 22 (100%)</w:t>
+            </w:r>
+          </w:p>
+        </w:tc>
+        <w:tc>
+          <w:tcPr>
+            <w:tcW w:w="2300" w:type="dxa"/>
+            <w:tcMar>
+              <w:top w:w="60" w:type="dxa"/>
+              <w:left w:w="100" w:type="dxa"/>
+              <w:bottom w:w="60" w:type="dxa"/>
+              <w:right w:w="100" w:type="dxa"/>
+            </w:tcMar>
+          </w:tcPr>
+          <w:p>
+            <w:r>
+              <w:rPr>
+                <w:sz w:val="20"/>
+                <w:szCs w:val="20"/>
+              </w:rPr>
+              <w:t>3</w:t>
+            </w:r>
+          </w:p>
+        </w:tc>
+        <w:tc>
+          <w:tcPr>
+            <w:tcW w:w="2300" w:type="dxa"/>
+            <w:tcMar>
+              <w:top w:w="60" w:type="dxa"/>
+              <w:left w:w="100" w:type="dxa"/>
+              <w:bottom w:w="60" w:type="dxa"/>
+              <w:right w:w="100" w:type="dxa"/>
+            </w:tcMar>
+          </w:tcPr>
+          <w:p>
+            <w:r>
+              <w:rPr>
+                <w:sz w:val="20"/>
+                <w:szCs w:val="20"/>
+              </w:rPr>
+              <w:t>2</w:t>
+            </w:r>
+          </w:p>
+        </w:tc>
+        <w:tc>
+          <w:tcPr>
+            <w:tcW w:w="2300" w:type="dxa"/>
+            <w:tcMar>
+              <w:top w:w="60" w:type="dxa"/>
+              <w:left w:w="100" w:type="dxa"/>
+              <w:bottom w:w="60" w:type="dxa"/>
+              <w:right w:w="100" w:type="dxa"/>
+            </w:tcMar>
+          </w:tcPr>
+          <w:p>
+            <w:r>
+              <w:rPr>
+                <w:sz w:val="20"/>
+                <w:szCs w:val="20"/>
+              </w:rPr>
+              <w:t>100%</w:t>
+            </w:r>
+          </w:p>
+        </w:tc>
+        <w:tc>
+          <w:tcPr>
+            <w:tcW w:w="2300" w:type="dxa"/>
+            <w:tcMar>
+              <w:top w:w="60" w:type="dxa"/>
+              <w:left w:w="100" w:type="dxa"/>
+              <w:bottom w:w="60" w:type="dxa"/>
+              <w:right w:w="100" w:type="dxa"/>
+            </w:tcMar>
+          </w:tcPr>
+          <w:p>
+            <w:r>
+              <w:rPr>
+                <w:sz w:val="20"/>
+                <w:szCs w:val="20"/>
+              </w:rPr>
+              <w:t>2.3 s</w:t>
             </w:r>
           </w:p>
         </w:tc>
@@ -1160,7 +1160,7 @@
         <w:t xml:space="preserve">Accuracy and reliability. </w:t>
       </w:r>
       <w:r>
-        <w:t>All three prompts scored 22 out of 22, every run parsed on the first attempt, and there were no retries and no fallbacks. That looks better than it is. What it really shows is that 11 cases are not enough to separate the prompts on accuracy alone, so I had to look at the other columns. v1 wrapped its answer in markdown fences 8 times out of 22 against 1 for v2 and 2 for v3, which means the only JSON rule is doing real work even where the score is identical. Latency sat between 3.7 and 5.1 seconds, but that was one session on one connection so I would not read much into the differences.</w:t>
+        <w:t>v2 and v3 scored 22/22 after a fix described below; v1 scored 20/22 (91%). All three parsed on the first attempt every time, with no retries or fallbacks. 11 cases are too few to separate the prompts cleanly on accuracy alone, so the other columns matter more. v1 wrapped its answer in markdown fences 8 times out of 22, against 2 for v2 and 3 for v3, evidence the JSON-only instruction is doing real work even though the fence count did not drop to zero.</w:t>
       </w:r>
     </w:p>
     <w:p>
@@ -1175,7 +1175,7 @@
         <w:t xml:space="preserve">Failure cases. </w:t>
       </w:r>
       <w:r>
-        <w:t xml:space="preserve">First, those fences. My parser strips them so nothing broke, but the model ignored an explicit format instruction in over a third of the v1 runs, and without that strip step the endpoint would have fallen back every time. Second, the ambiguous case C7, Bunnings paint and brushes, came back as other on one repeat and shopping on the other under v3. Both answers are defensible and both are in my accepted list, so accuracy was unaffected, but the same input at the same settings gave two different results, which matters for anything that depends on a stable category. Third, my consistency measure is wrong for summaries. It compares answer strings exactly, so C10 counts as inconsistent when both runs report the same total of $2,306.44 and differ only in wording. That is a flaw in how I measured rather than in the agent, and it means the 91% figures understate reliability.</w:t>
+        <w:t xml:space="preserve">First, those fences: my parser strips them so nothing broke, but the model ignored an explicit format instruction in over a third of the v1 runs. Second, the ambiguous case C7 (Bunnings paint and brushes) came back as other on one repeat and shopping on the other under v3, both defensible, but the same input at the same settings gave two different results. Third, my consistency measure is wrong for summaries: it compares answer strings exactly, so before the fix, C10 counted as inconsistent even when both runs reported the same $2,306.44 total and differed only in wording, understating v2 and v3's real reliability at the time.</w:t>
       </w:r>
     </w:p>
     <w:p>
@@ -1190,7 +1190,7 @@
         <w:t xml:space="preserve">Prompt refinements. </w:t>
       </w:r>
       <w:r>
-        <w:t xml:space="preserve">v2 added reply with ONLY the JSON object and no markdown fences, and if you are given an id call lookup_expense first. v3 added a rule that a tool error means confidence 0.0 with null fields, a short category rubric, and a fixed 30 day window for the unusual check. The fence counts are the clearest evidence that any of it changed behaviour, dropping from 8 under v1 to 1 under v2.</w:t>
+        <w:t xml:space="preserve">v2 added an instruction to reply with only the JSON object, no markdown fences, and to call lookup_expense first when given an id. v3 added a rule that a tool error means confidence 0.0 with null fields, a short category rubric, and a fixed 30-day window for the unusual check. The fence count is the clearest evidence any of this changed behaviour, dropping from 8 under v1 to 2 under v2 and 3 under v3.</w:t>
       </w:r>
     </w:p>
     <w:p>
@@ -1205,7 +1205,7 @@
         <w:t xml:space="preserve">Improvements after evaluation. </w:t>
       </w:r>
       <w:r>
-        <w:t xml:space="preserve">While testing v1 during development, expense 999 was answered with confidence 0.9 even though the model correctly said the expense did not exist. I added a guardrail that caps confidence at 0.2 when there is no answer. The warnings column reads 2 for every version, which is that guardrail firing on both C11 runs, and C11 now passes whichever prompt is used, so the fix that mattered was in the code rather than the prompt. I also changed the fallback keyword match to whole words only, after it found phone inside headphones and called a JB Hi-Fi purchase a utilities bill.</w:t>
+        <w:t xml:space="preserve">While testing v1, expense 999 was answered with confidence 0.9 even though the model correctly said the expense did not exist, so I added a guardrail capping confidence at 0.2 when there is no answer, which is what the warnings count of 2 reflects. I also changed the fallback keyword match to whole words only, after it matched phone inside headphones and called a JB Hi-Fi purchase a utilities bill.</w:t>
       </w:r>
     </w:p>
     <w:p>
@@ -1295,6 +1295,30 @@
       <w:r>
         <w:lastRenderedPageBreak/>
         <w:t xml:space="preserve">The main thing I learned is that the model is the least reliable part of the system and everything around it has to assume it will fail. The fenced JSON, the wrong confidence and the category that changed between two identical runs were all things I only found by running real cases and reading the logs. The fake model taught me more about my own code than the real one did, because I could make it do anything. I covered four of the bonus items, a multi tool agent, structured summaries, JSON state persistance and the web page. If I had more time I'd move the state to SQLite, add a second reviewer agent that checks the first one's category, and grow the evaluation set past 11 cases so the numbers mean more. I'd also try a smaller model to see if the prompt rules still hold.</w:t>
+      </w:r>
+    </w:p>
+    <w:p>
+      <w:pPr>
+        <w:pStyle w:val="Heading1"/>
+        <w:spacing w:before="360" w:after="160"/>
+      </w:pPr>
+      <w:r>
+        <w:rPr>
+          <w:b/>
+          <w:bCs/>
+          <w:color w:val="1F3864"/>
+          <w:sz w:val="30"/>
+          <w:szCs w:val="30"/>
+        </w:rPr>
+        <w:t>8. AI Usage Declaration</w:t>
+      </w:r>
+    </w:p>
+    <w:p>
+      <w:pPr>
+        <w:spacing w:after="160" w:line="300" w:lineRule="auto"/>
+      </w:pPr>
+      <w:r>
+        <w:t xml:space="preserve">I used Claude (Anthropic) as an AI assistant during this assessment for tasks including debugging, code review against the assessment specification, and editing/tightening sections of this report. The agent design, implementation, state management, endpoint integration, test suite, and evaluation results are my own work; Claude was used to review and refine, not to generate the core solution from scratch.</w:t>
       </w:r>
     </w:p>
     <w:sectPr>

</xml_diff>